<commit_message>
fix(adp-historical): resolve the ⋯ popup in the trigger's own document (v1.11.2)
The Reports Output grid lives inside the same-origin <iframe id="adprIframe">
(basic/Reporting/indexPortalLight.do) — confirmed from the DevTools frame
selector. menuHost() looked the popup up with a top-level document
.getElementById(aria-owns), which cannot see a popup Dojo attached inside the
frame. Search the trigger's own document first, then the top one.

Also: ADP leaves aria-expanded="false" on an OPEN menu while popupactive is
"true" (captured live), which made the diagnostic claim the menu was closed
when it was not. Treat either attribute as open.

Co-Authored-By: Claude Opus 5 <noreply@anthropic.com>
</commit_message>
<xml_diff>
--- a/distribution-docs/ADP Historical Data Bot.docx
+++ b/distribution-docs/ADP Historical Data Bot.docx
@@ -64,7 +64,7 @@
           <w:sz w:val="16"/>
           <w:szCs w:val="16"/>
         </w:rPr>
-        <w:t xml:space="preserve">// @version      1.11.1</w:t>
+        <w:t xml:space="preserve">// @version      1.11.2</w:t>
       </w:r>
     </w:p>
     <w:p>
@@ -20474,6 +20474,84 @@
           <w:sz w:val="16"/>
           <w:szCs w:val="16"/>
         </w:rPr>
+        <w:t xml:space="preserve">    // Look the popup up in the TRIGGER's document, not `document`: the whole</w:t>
+      </w:r>
+    </w:p>
+    <w:p>
+      <w:pPr>
+        <w:spacing w:after="0" w:line="220"/>
+      </w:pPr>
+      <w:r>
+        <w:rPr>
+          <w:rFonts w:ascii="Consolas" w:cs="Consolas" w:eastAsia="Consolas" w:hAnsi="Consolas"/>
+          <w:sz w:val="16"/>
+          <w:szCs w:val="16"/>
+        </w:rPr>
+        <w:t xml:space="preserve">    // Reports Output grid lives inside the same-origin &lt;iframe id="adprIframe"&gt;</w:t>
+      </w:r>
+    </w:p>
+    <w:p>
+      <w:pPr>
+        <w:spacing w:after="0" w:line="220"/>
+      </w:pPr>
+      <w:r>
+        <w:rPr>
+          <w:rFonts w:ascii="Consolas" w:cs="Consolas" w:eastAsia="Consolas" w:hAnsi="Consolas"/>
+          <w:sz w:val="16"/>
+          <w:szCs w:val="16"/>
+        </w:rPr>
+        <w:t xml:space="preserve">    // (basic/Reporting/indexPortalLight.do), so a top-level getElementById</w:t>
+      </w:r>
+    </w:p>
+    <w:p>
+      <w:pPr>
+        <w:spacing w:after="0" w:line="220"/>
+      </w:pPr>
+      <w:r>
+        <w:rPr>
+          <w:rFonts w:ascii="Consolas" w:cs="Consolas" w:eastAsia="Consolas" w:hAnsi="Consolas"/>
+          <w:sz w:val="16"/>
+          <w:szCs w:val="16"/>
+        </w:rPr>
+        <w:t xml:space="preserve">    // would miss a popup Dojo attached inside the frame.</w:t>
+      </w:r>
+    </w:p>
+    <w:p>
+      <w:pPr>
+        <w:spacing w:after="0" w:line="220"/>
+      </w:pPr>
+      <w:r>
+        <w:rPr>
+          <w:rFonts w:ascii="Consolas" w:cs="Consolas" w:eastAsia="Consolas" w:hAnsi="Consolas"/>
+          <w:sz w:val="16"/>
+          <w:szCs w:val="16"/>
+        </w:rPr>
+        <w:t xml:space="preserve">    // ADP also leaves aria-expanded="false" on an open menu while</w:t>
+      </w:r>
+    </w:p>
+    <w:p>
+      <w:pPr>
+        <w:spacing w:after="0" w:line="220"/>
+      </w:pPr>
+      <w:r>
+        <w:rPr>
+          <w:rFonts w:ascii="Consolas" w:cs="Consolas" w:eastAsia="Consolas" w:hAnsi="Consolas"/>
+          <w:sz w:val="16"/>
+          <w:szCs w:val="16"/>
+        </w:rPr>
+        <w:t xml:space="preserve">    // popupactive="true" — observed live — so trust either.</w:t>
+      </w:r>
+    </w:p>
+    <w:p>
+      <w:pPr>
+        <w:spacing w:after="0" w:line="220"/>
+      </w:pPr>
+      <w:r>
+        <w:rPr>
+          <w:rFonts w:ascii="Consolas" w:cs="Consolas" w:eastAsia="Consolas" w:hAnsi="Consolas"/>
+          <w:sz w:val="16"/>
+          <w:szCs w:val="16"/>
+        </w:rPr>
         <w:t xml:space="preserve">    const menuHost = () =&gt; {</w:t>
       </w:r>
     </w:p>
@@ -20513,46 +20591,124 @@
           <w:sz w:val="16"/>
           <w:szCs w:val="16"/>
         </w:rPr>
-        <w:t xml:space="preserve">      const owns = btn.getAttribute &amp;&amp; btn.getAttribute('aria-owns');</w:t>
-      </w:r>
-    </w:p>
-    <w:p>
-      <w:pPr>
-        <w:spacing w:after="0" w:line="220"/>
-      </w:pPr>
-      <w:r>
-        <w:rPr>
-          <w:rFonts w:ascii="Consolas" w:cs="Consolas" w:eastAsia="Consolas" w:hAnsi="Consolas"/>
-          <w:sz w:val="16"/>
-          <w:szCs w:val="16"/>
-        </w:rPr>
-        <w:t xml:space="preserve">      const expanded = (btn.getAttribute &amp;&amp; btn.getAttribute('aria-expanded')) === 'true';</w:t>
-      </w:r>
-    </w:p>
-    <w:p>
-      <w:pPr>
-        <w:spacing w:after="0" w:line="220"/>
-      </w:pPr>
-      <w:r>
-        <w:rPr>
-          <w:rFonts w:ascii="Consolas" w:cs="Consolas" w:eastAsia="Consolas" w:hAnsi="Consolas"/>
-          <w:sz w:val="16"/>
-          <w:szCs w:val="16"/>
-        </w:rPr>
-        <w:t xml:space="preserve">      const pop = owns ? document.getElementById(owns) : null;</w:t>
-      </w:r>
-    </w:p>
-    <w:p>
-      <w:pPr>
-        <w:spacing w:after="0" w:line="220"/>
-      </w:pPr>
-      <w:r>
-        <w:rPr>
-          <w:rFonts w:ascii="Consolas" w:cs="Consolas" w:eastAsia="Consolas" w:hAnsi="Consolas"/>
-          <w:sz w:val="16"/>
-          <w:szCs w:val="16"/>
-        </w:rPr>
-        <w:t xml:space="preserve">      return { expanded, pop: (pop &amp;&amp; visible(pop)) ? pop : null };</w:t>
+        <w:t xml:space="preserve">      const attr = (n) =&gt; (btn.getAttribute &amp;&amp; btn.getAttribute(n)) || '';</w:t>
+      </w:r>
+    </w:p>
+    <w:p>
+      <w:pPr>
+        <w:spacing w:after="0" w:line="220"/>
+      </w:pPr>
+      <w:r>
+        <w:rPr>
+          <w:rFonts w:ascii="Consolas" w:cs="Consolas" w:eastAsia="Consolas" w:hAnsi="Consolas"/>
+          <w:sz w:val="16"/>
+          <w:szCs w:val="16"/>
+        </w:rPr>
+        <w:t xml:space="preserve">      const owns = attr('aria-owns');</w:t>
+      </w:r>
+    </w:p>
+    <w:p>
+      <w:pPr>
+        <w:spacing w:after="0" w:line="220"/>
+      </w:pPr>
+      <w:r>
+        <w:rPr>
+          <w:rFonts w:ascii="Consolas" w:cs="Consolas" w:eastAsia="Consolas" w:hAnsi="Consolas"/>
+          <w:sz w:val="16"/>
+          <w:szCs w:val="16"/>
+        </w:rPr>
+        <w:t xml:space="preserve">      const expanded = attr('aria-expanded') === 'true' || attr('popupactive') === 'true';</w:t>
+      </w:r>
+    </w:p>
+    <w:p>
+      <w:pPr>
+        <w:spacing w:after="0" w:line="220"/>
+      </w:pPr>
+      <w:r>
+        <w:rPr>
+          <w:rFonts w:ascii="Consolas" w:cs="Consolas" w:eastAsia="Consolas" w:hAnsi="Consolas"/>
+          <w:sz w:val="16"/>
+          <w:szCs w:val="16"/>
+        </w:rPr>
+        <w:t xml:space="preserve">      const docs = [trigger.ownerDocument, document].filter(Boolean);</w:t>
+      </w:r>
+    </w:p>
+    <w:p>
+      <w:pPr>
+        <w:spacing w:after="0" w:line="220"/>
+      </w:pPr>
+      <w:r>
+        <w:rPr>
+          <w:rFonts w:ascii="Consolas" w:cs="Consolas" w:eastAsia="Consolas" w:hAnsi="Consolas"/>
+          <w:sz w:val="16"/>
+          <w:szCs w:val="16"/>
+        </w:rPr>
+        <w:t xml:space="preserve">      let pop = null;</w:t>
+      </w:r>
+    </w:p>
+    <w:p>
+      <w:pPr>
+        <w:spacing w:after="0" w:line="220"/>
+      </w:pPr>
+      <w:r>
+        <w:rPr>
+          <w:rFonts w:ascii="Consolas" w:cs="Consolas" w:eastAsia="Consolas" w:hAnsi="Consolas"/>
+          <w:sz w:val="16"/>
+          <w:szCs w:val="16"/>
+        </w:rPr>
+        <w:t xml:space="preserve">      for (const d of docs) {</w:t>
+      </w:r>
+    </w:p>
+    <w:p>
+      <w:pPr>
+        <w:spacing w:after="0" w:line="220"/>
+      </w:pPr>
+      <w:r>
+        <w:rPr>
+          <w:rFonts w:ascii="Consolas" w:cs="Consolas" w:eastAsia="Consolas" w:hAnsi="Consolas"/>
+          <w:sz w:val="16"/>
+          <w:szCs w:val="16"/>
+        </w:rPr>
+        <w:t xml:space="preserve">        const el = owns &amp;&amp; d.getElementById ? d.getElementById(owns) : null;</w:t>
+      </w:r>
+    </w:p>
+    <w:p>
+      <w:pPr>
+        <w:spacing w:after="0" w:line="220"/>
+      </w:pPr>
+      <w:r>
+        <w:rPr>
+          <w:rFonts w:ascii="Consolas" w:cs="Consolas" w:eastAsia="Consolas" w:hAnsi="Consolas"/>
+          <w:sz w:val="16"/>
+          <w:szCs w:val="16"/>
+        </w:rPr>
+        <w:t xml:space="preserve">        if (el &amp;&amp; visible(el)) { pop = el; break; }</w:t>
+      </w:r>
+    </w:p>
+    <w:p>
+      <w:pPr>
+        <w:spacing w:after="0" w:line="220"/>
+      </w:pPr>
+      <w:r>
+        <w:rPr>
+          <w:rFonts w:ascii="Consolas" w:cs="Consolas" w:eastAsia="Consolas" w:hAnsi="Consolas"/>
+          <w:sz w:val="16"/>
+          <w:szCs w:val="16"/>
+        </w:rPr>
+        <w:t xml:space="preserve">      }</w:t>
+      </w:r>
+    </w:p>
+    <w:p>
+      <w:pPr>
+        <w:spacing w:after="0" w:line="220"/>
+      </w:pPr>
+      <w:r>
+        <w:rPr>
+          <w:rFonts w:ascii="Consolas" w:cs="Consolas" w:eastAsia="Consolas" w:hAnsi="Consolas"/>
+          <w:sz w:val="16"/>
+          <w:szCs w:val="16"/>
+        </w:rPr>
+        <w:t xml:space="preserve">      return { expanded, pop };</w:t>
       </w:r>
     </w:p>
     <w:p>

</xml_diff>

<commit_message>
fix(adp-historical): click the menu item ONCE (v1.12.1)
mouseSeq() already ends in a click event, so firing clickEl() and a dijitclick
alongside it ran the handler two or three times. That was invisible while the
click was landing on the wrong element; the moment v1.12.0 started hitting the
real <a>, every run produced two or three copies of the PDF.

Fire mouseSeq alone, and escalate to the plain click + dijitclick only after
~2.4s of complete silence from the sniffer (i.e. the click reached no handler
at all), logging when that happens.

Co-Authored-By: Claude Opus 5 <noreply@anthropic.com>
</commit_message>
<xml_diff>
--- a/distribution-docs/ADP Historical Data Bot.docx
+++ b/distribution-docs/ADP Historical Data Bot.docx
@@ -64,7 +64,7 @@
           <w:sz w:val="16"/>
           <w:szCs w:val="16"/>
         </w:rPr>
-        <w:t xml:space="preserve">// @version      1.12.0</w:t>
+        <w:t xml:space="preserve">// @version      1.12.1</w:t>
       </w:r>
     </w:p>
     <w:p>
@@ -22281,7 +22281,59 @@
           <w:sz w:val="16"/>
           <w:szCs w:val="16"/>
         </w:rPr>
-        <w:t xml:space="preserve">      // NOT clickRevit: that re-targets to the nearest .revitButton ancestor,</w:t>
+        <w:t xml:space="preserve">      // ONE click. mouseSeq already ends in a click event, so firing .click()</w:t>
+      </w:r>
+    </w:p>
+    <w:p>
+      <w:pPr>
+        <w:spacing w:after="0" w:line="220"/>
+      </w:pPr>
+      <w:r>
+        <w:rPr>
+          <w:rFonts w:ascii="Consolas" w:cs="Consolas" w:eastAsia="Consolas" w:hAnsi="Consolas"/>
+          <w:sz w:val="16"/>
+          <w:szCs w:val="16"/>
+        </w:rPr>
+        <w:t xml:space="preserve">      // and dijitclick alongside it means the handler runs two or three times —</w:t>
+      </w:r>
+    </w:p>
+    <w:p>
+      <w:pPr>
+        <w:spacing w:after="0" w:line="220"/>
+      </w:pPr>
+      <w:r>
+        <w:rPr>
+          <w:rFonts w:ascii="Consolas" w:cs="Consolas" w:eastAsia="Consolas" w:hAnsi="Consolas"/>
+          <w:sz w:val="16"/>
+          <w:szCs w:val="16"/>
+        </w:rPr>
+        <w:t xml:space="preserve">      // once the target was finally correct that produced two or three copies of</w:t>
+      </w:r>
+    </w:p>
+    <w:p>
+      <w:pPr>
+        <w:spacing w:after="0" w:line="220"/>
+      </w:pPr>
+      <w:r>
+        <w:rPr>
+          <w:rFonts w:ascii="Consolas" w:cs="Consolas" w:eastAsia="Consolas" w:hAnsi="Consolas"/>
+          <w:sz w:val="16"/>
+          <w:szCs w:val="16"/>
+        </w:rPr>
+        <w:t xml:space="preserve">      // the PDF. Escalate to the other methods only if nothing was requested.</w:t>
+      </w:r>
+    </w:p>
+    <w:p>
+      <w:pPr>
+        <w:spacing w:after="0" w:line="220"/>
+      </w:pPr>
+      <w:r>
+        <w:rPr>
+          <w:rFonts w:ascii="Consolas" w:cs="Consolas" w:eastAsia="Consolas" w:hAnsi="Consolas"/>
+          <w:sz w:val="16"/>
+          <w:szCs w:val="16"/>
+        </w:rPr>
+        <w:t xml:space="preserve">      // NOT clickRevit: it re-targets to the nearest .revitButton ancestor,</w:t>
       </w:r>
     </w:p>
     <w:p>
@@ -22333,20 +22385,7 @@
           <w:sz w:val="16"/>
           <w:szCs w:val="16"/>
         </w:rPr>
-        <w:t xml:space="preserve">      clickEl(clickTarget);             // plain click too, for ordinary anchors</w:t>
-      </w:r>
-    </w:p>
-    <w:p>
-      <w:pPr>
-        <w:spacing w:after="0" w:line="220"/>
-      </w:pPr>
-      <w:r>
-        <w:rPr>
-          <w:rFonts w:ascii="Consolas" w:cs="Consolas" w:eastAsia="Consolas" w:hAnsi="Consolas"/>
-          <w:sz w:val="16"/>
-          <w:szCs w:val="16"/>
-        </w:rPr>
-        <w:t xml:space="preserve">      try { clickTarget.dispatchEvent(new Event('dijitclick', { bubbles: true, cancelable: true })); } catch (_) { }</w:t>
+        <w:t xml:space="preserve">      let escalated = false;</w:t>
       </w:r>
     </w:p>
     <w:p>
@@ -22425,6 +22464,97 @@
           <w:szCs w:val="16"/>
         </w:rPr>
         <w:t xml:space="preserve">        if (url &amp;&amp; i &gt;= 20) break; // give the real URL ~6s, then work with the viewer</w:t>
+      </w:r>
+    </w:p>
+    <w:p>
+      <w:pPr>
+        <w:spacing w:after="0" w:line="220"/>
+      </w:pPr>
+      <w:r>
+        <w:rPr>
+          <w:rFonts w:ascii="Consolas" w:cs="Consolas" w:eastAsia="Consolas" w:hAnsi="Consolas"/>
+          <w:sz w:val="16"/>
+          <w:szCs w:val="16"/>
+        </w:rPr>
+        <w:t xml:space="preserve">        // ~2.4s of complete silence means the click never reached a handler.</w:t>
+      </w:r>
+    </w:p>
+    <w:p>
+      <w:pPr>
+        <w:spacing w:after="0" w:line="220"/>
+      </w:pPr>
+      <w:r>
+        <w:rPr>
+          <w:rFonts w:ascii="Consolas" w:cs="Consolas" w:eastAsia="Consolas" w:hAnsi="Consolas"/>
+          <w:sz w:val="16"/>
+          <w:szCs w:val="16"/>
+        </w:rPr>
+        <w:t xml:space="preserve">        if (!escalated &amp;&amp; !arr.length &amp;&amp; i === 8) {</w:t>
+      </w:r>
+    </w:p>
+    <w:p>
+      <w:pPr>
+        <w:spacing w:after="0" w:line="220"/>
+      </w:pPr>
+      <w:r>
+        <w:rPr>
+          <w:rFonts w:ascii="Consolas" w:cs="Consolas" w:eastAsia="Consolas" w:hAnsi="Consolas"/>
+          <w:sz w:val="16"/>
+          <w:szCs w:val="16"/>
+        </w:rPr>
+        <w:t xml:space="preserve">          escalated = true;</w:t>
+      </w:r>
+    </w:p>
+    <w:p>
+      <w:pPr>
+        <w:spacing w:after="0" w:line="220"/>
+      </w:pPr>
+      <w:r>
+        <w:rPr>
+          <w:rFonts w:ascii="Consolas" w:cs="Consolas" w:eastAsia="Consolas" w:hAnsi="Consolas"/>
+          <w:sz w:val="16"/>
+          <w:szCs w:val="16"/>
+        </w:rPr>
+        <w:t xml:space="preserve">          logInfo('No request after the click — retrying with a plain click + dijitclick');</w:t>
+      </w:r>
+    </w:p>
+    <w:p>
+      <w:pPr>
+        <w:spacing w:after="0" w:line="220"/>
+      </w:pPr>
+      <w:r>
+        <w:rPr>
+          <w:rFonts w:ascii="Consolas" w:cs="Consolas" w:eastAsia="Consolas" w:hAnsi="Consolas"/>
+          <w:sz w:val="16"/>
+          <w:szCs w:val="16"/>
+        </w:rPr>
+        <w:t xml:space="preserve">          clickEl(clickTarget);</w:t>
+      </w:r>
+    </w:p>
+    <w:p>
+      <w:pPr>
+        <w:spacing w:after="0" w:line="220"/>
+      </w:pPr>
+      <w:r>
+        <w:rPr>
+          <w:rFonts w:ascii="Consolas" w:cs="Consolas" w:eastAsia="Consolas" w:hAnsi="Consolas"/>
+          <w:sz w:val="16"/>
+          <w:szCs w:val="16"/>
+        </w:rPr>
+        <w:t xml:space="preserve">          try { clickTarget.dispatchEvent(new Event('dijitclick', { bubbles: true, cancelable: true })); } catch (_) { }</w:t>
+      </w:r>
+    </w:p>
+    <w:p>
+      <w:pPr>
+        <w:spacing w:after="0" w:line="220"/>
+      </w:pPr>
+      <w:r>
+        <w:rPr>
+          <w:rFonts w:ascii="Consolas" w:cs="Consolas" w:eastAsia="Consolas" w:hAnsi="Consolas"/>
+          <w:sz w:val="16"/>
+          <w:szCs w:val="16"/>
+        </w:rPr>
+        <w:t xml:space="preserve">        }</w:t>
       </w:r>
     </w:p>
     <w:p>

</xml_diff>

<commit_message>
fix(adp-historical): read the displayed version from GM_info (v1.13.1)
SCRIPT_VERSION was a second hardcoded copy of the version and still read
'1.10.1' after four releases, so the panel badge and every 'Historical Data Bot
ready (vX)' log line named a version that was not running. During a live
debugging session that is the single fact you most need to trust — it is how
you tell 'the fix did not work' from 'the fix is not loaded'.

Derive it from GM_info.script.version, the way the Paycom bot already does
(which is why its logs were always right). The literal is now only a fallback
for when GM_info is unavailable.

Co-Authored-By: Claude Opus 5 <noreply@anthropic.com>
</commit_message>
<xml_diff>
--- a/distribution-docs/ADP Historical Data Bot.docx
+++ b/distribution-docs/ADP Historical Data Bot.docx
@@ -64,7 +64,7 @@
           <w:sz w:val="16"/>
           <w:szCs w:val="16"/>
         </w:rPr>
-        <w:t xml:space="preserve">// @version      1.13.0</w:t>
+        <w:t xml:space="preserve">// @version      1.13.1</w:t>
       </w:r>
     </w:p>
     <w:p>
@@ -506,7 +506,163 @@
           <w:sz w:val="16"/>
           <w:szCs w:val="16"/>
         </w:rPr>
-        <w:t xml:space="preserve">  const SCRIPT_VERSION = '1.10.1';</w:t>
+        <w:t xml:space="preserve">  // Read the version from Tampermonkey rather than repeating it here. A second</w:t>
+      </w:r>
+    </w:p>
+    <w:p>
+      <w:pPr>
+        <w:spacing w:after="0" w:line="220"/>
+      </w:pPr>
+      <w:r>
+        <w:rPr>
+          <w:rFonts w:ascii="Consolas" w:cs="Consolas" w:eastAsia="Consolas" w:hAnsi="Consolas"/>
+          <w:sz w:val="16"/>
+          <w:szCs w:val="16"/>
+        </w:rPr>
+        <w:t xml:space="preserve">  // hardcoded copy silently drifts: this said 1.10.1 while @version had moved</w:t>
+      </w:r>
+    </w:p>
+    <w:p>
+      <w:pPr>
+        <w:spacing w:after="0" w:line="220"/>
+      </w:pPr>
+      <w:r>
+        <w:rPr>
+          <w:rFonts w:ascii="Consolas" w:cs="Consolas" w:eastAsia="Consolas" w:hAnsi="Consolas"/>
+          <w:sz w:val="16"/>
+          <w:szCs w:val="16"/>
+        </w:rPr>
+        <w:t xml:space="preserve">  // on four releases, so the panel and every log line reported a version that</w:t>
+      </w:r>
+    </w:p>
+    <w:p>
+      <w:pPr>
+        <w:spacing w:after="0" w:line="220"/>
+      </w:pPr>
+      <w:r>
+        <w:rPr>
+          <w:rFonts w:ascii="Consolas" w:cs="Consolas" w:eastAsia="Consolas" w:hAnsi="Consolas"/>
+          <w:sz w:val="16"/>
+          <w:szCs w:val="16"/>
+        </w:rPr>
+        <w:t xml:space="preserve">  // was not running — the one thing you must be able to trust when debugging a</w:t>
+      </w:r>
+    </w:p>
+    <w:p>
+      <w:pPr>
+        <w:spacing w:after="0" w:line="220"/>
+      </w:pPr>
+      <w:r>
+        <w:rPr>
+          <w:rFonts w:ascii="Consolas" w:cs="Consolas" w:eastAsia="Consolas" w:hAnsi="Consolas"/>
+          <w:sz w:val="16"/>
+          <w:szCs w:val="16"/>
+        </w:rPr>
+        <w:t xml:space="preserve">  // live run. The literal below is only a fallback for when GM_info is absent.</w:t>
+      </w:r>
+    </w:p>
+    <w:p>
+      <w:pPr>
+        <w:spacing w:after="0" w:line="220"/>
+      </w:pPr>
+      <w:r>
+        <w:rPr>
+          <w:rFonts w:ascii="Consolas" w:cs="Consolas" w:eastAsia="Consolas" w:hAnsi="Consolas"/>
+          <w:sz w:val="16"/>
+          <w:szCs w:val="16"/>
+        </w:rPr>
+        <w:t xml:space="preserve">  const SCRIPT_VERSION = (() =&gt; {</w:t>
+      </w:r>
+    </w:p>
+    <w:p>
+      <w:pPr>
+        <w:spacing w:after="0" w:line="220"/>
+      </w:pPr>
+      <w:r>
+        <w:rPr>
+          <w:rFonts w:ascii="Consolas" w:cs="Consolas" w:eastAsia="Consolas" w:hAnsi="Consolas"/>
+          <w:sz w:val="16"/>
+          <w:szCs w:val="16"/>
+        </w:rPr>
+        <w:t xml:space="preserve">    try {</w:t>
+      </w:r>
+    </w:p>
+    <w:p>
+      <w:pPr>
+        <w:spacing w:after="0" w:line="220"/>
+      </w:pPr>
+      <w:r>
+        <w:rPr>
+          <w:rFonts w:ascii="Consolas" w:cs="Consolas" w:eastAsia="Consolas" w:hAnsi="Consolas"/>
+          <w:sz w:val="16"/>
+          <w:szCs w:val="16"/>
+        </w:rPr>
+        <w:t xml:space="preserve">      if (typeof GM_info !== 'undefined' &amp;&amp; GM_info.script &amp;&amp; GM_info.script.version) {</w:t>
+      </w:r>
+    </w:p>
+    <w:p>
+      <w:pPr>
+        <w:spacing w:after="0" w:line="220"/>
+      </w:pPr>
+      <w:r>
+        <w:rPr>
+          <w:rFonts w:ascii="Consolas" w:cs="Consolas" w:eastAsia="Consolas" w:hAnsi="Consolas"/>
+          <w:sz w:val="16"/>
+          <w:szCs w:val="16"/>
+        </w:rPr>
+        <w:t xml:space="preserve">        return GM_info.script.version;</w:t>
+      </w:r>
+    </w:p>
+    <w:p>
+      <w:pPr>
+        <w:spacing w:after="0" w:line="220"/>
+      </w:pPr>
+      <w:r>
+        <w:rPr>
+          <w:rFonts w:ascii="Consolas" w:cs="Consolas" w:eastAsia="Consolas" w:hAnsi="Consolas"/>
+          <w:sz w:val="16"/>
+          <w:szCs w:val="16"/>
+        </w:rPr>
+        <w:t xml:space="preserve">      }</w:t>
+      </w:r>
+    </w:p>
+    <w:p>
+      <w:pPr>
+        <w:spacing w:after="0" w:line="220"/>
+      </w:pPr>
+      <w:r>
+        <w:rPr>
+          <w:rFonts w:ascii="Consolas" w:cs="Consolas" w:eastAsia="Consolas" w:hAnsi="Consolas"/>
+          <w:sz w:val="16"/>
+          <w:szCs w:val="16"/>
+        </w:rPr>
+        <w:t xml:space="preserve">    } catch (_) { }</w:t>
+      </w:r>
+    </w:p>
+    <w:p>
+      <w:pPr>
+        <w:spacing w:after="0" w:line="220"/>
+      </w:pPr>
+      <w:r>
+        <w:rPr>
+          <w:rFonts w:ascii="Consolas" w:cs="Consolas" w:eastAsia="Consolas" w:hAnsi="Consolas"/>
+          <w:sz w:val="16"/>
+          <w:szCs w:val="16"/>
+        </w:rPr>
+        <w:t xml:space="preserve">    return '1.13.1';</w:t>
+      </w:r>
+    </w:p>
+    <w:p>
+      <w:pPr>
+        <w:spacing w:after="0" w:line="220"/>
+      </w:pPr>
+      <w:r>
+        <w:rPr>
+          <w:rFonts w:ascii="Consolas" w:cs="Consolas" w:eastAsia="Consolas" w:hAnsi="Consolas"/>
+          <w:sz w:val="16"/>
+          <w:szCs w:val="16"/>
+        </w:rPr>
+        <w:t xml:space="preserve">  })();</w:t>
       </w:r>
     </w:p>
     <w:p>

</xml_diff>

<commit_message>
feat(adp-historical): offer the current year in Payroll History (v1.14.0)
The picker only offered the three prior calendar years; the current one was
excluded because the day-to-day adp-reports bot covers it. But that bot pulls
per-pay-period files, and a migration wants one continuous consolidated set, so
the current year had to be fetched by hand.

- historicalYears() now returns [y-3, y-2, y-1, y]; untick it in the picker
  when it isn't wanted
- yearDateRange() caps the CURRENT year at today. 01/01 → 12/31 would ask ADP
  for a range running months into the future
- saved as HistoricalPayroll_<year>-to-date.xlsx so a partial year is never
  mistaken for a full one — the convention the Paycom historical bot uses
- picker hint says what the current-year option does

Tested against a frozen clock, including 1 Jan (one-day range, and last year
correctly reverting to a full range) and 31 Dec.

Co-Authored-By: Claude Opus 5 <noreply@anthropic.com>
</commit_message>
<xml_diff>
--- a/distribution-docs/ADP Historical Data Bot.docx
+++ b/distribution-docs/ADP Historical Data Bot.docx
@@ -64,7 +64,7 @@
           <w:sz w:val="16"/>
           <w:szCs w:val="16"/>
         </w:rPr>
-        <w:t xml:space="preserve">// @version      1.13.1</w:t>
+        <w:t xml:space="preserve">// @version      1.14.0</w:t>
       </w:r>
     </w:p>
     <w:p>
@@ -649,7 +649,7 @@
           <w:sz w:val="16"/>
           <w:szCs w:val="16"/>
         </w:rPr>
-        <w:t xml:space="preserve">    return '1.13.1';</w:t>
+        <w:t xml:space="preserve">    return '1.14.0';</w:t>
       </w:r>
     </w:p>
     <w:p>
@@ -12349,6 +12349,45 @@
           <w:sz w:val="16"/>
           <w:szCs w:val="16"/>
         </w:rPr>
+        <w:t xml:space="preserve">  // A past year is the whole calendar year. The CURRENT year must stop at</w:t>
+      </w:r>
+    </w:p>
+    <w:p>
+      <w:pPr>
+        <w:spacing w:after="0" w:line="220"/>
+      </w:pPr>
+      <w:r>
+        <w:rPr>
+          <w:rFonts w:ascii="Consolas" w:cs="Consolas" w:eastAsia="Consolas" w:hAnsi="Consolas"/>
+          <w:sz w:val="16"/>
+          <w:szCs w:val="16"/>
+        </w:rPr>
+        <w:t xml:space="preserve">  // today — asking ADP for a range that runs into the future is not a range</w:t>
+      </w:r>
+    </w:p>
+    <w:p>
+      <w:pPr>
+        <w:spacing w:after="0" w:line="220"/>
+      </w:pPr>
+      <w:r>
+        <w:rPr>
+          <w:rFonts w:ascii="Consolas" w:cs="Consolas" w:eastAsia="Consolas" w:hAnsi="Consolas"/>
+          <w:sz w:val="16"/>
+          <w:szCs w:val="16"/>
+        </w:rPr>
+        <w:t xml:space="preserve">  // the report is meant to take, and there is no data there to fetch anyway.</w:t>
+      </w:r>
+    </w:p>
+    <w:p>
+      <w:pPr>
+        <w:spacing w:after="0" w:line="220"/>
+      </w:pPr>
+      <w:r>
+        <w:rPr>
+          <w:rFonts w:ascii="Consolas" w:cs="Consolas" w:eastAsia="Consolas" w:hAnsi="Consolas"/>
+          <w:sz w:val="16"/>
+          <w:szCs w:val="16"/>
+        </w:rPr>
         <w:t xml:space="preserve">  function yearDateRange(year) {</w:t>
       </w:r>
     </w:p>
@@ -12362,6 +12401,97 @@
           <w:sz w:val="16"/>
           <w:szCs w:val="16"/>
         </w:rPr>
+        <w:t xml:space="preserve">    const now = new Date();</w:t>
+      </w:r>
+    </w:p>
+    <w:p>
+      <w:pPr>
+        <w:spacing w:after="0" w:line="220"/>
+      </w:pPr>
+      <w:r>
+        <w:rPr>
+          <w:rFonts w:ascii="Consolas" w:cs="Consolas" w:eastAsia="Consolas" w:hAnsi="Consolas"/>
+          <w:sz w:val="16"/>
+          <w:szCs w:val="16"/>
+        </w:rPr>
+        <w:t xml:space="preserve">    if (year === now.getFullYear()) {</w:t>
+      </w:r>
+    </w:p>
+    <w:p>
+      <w:pPr>
+        <w:spacing w:after="0" w:line="220"/>
+      </w:pPr>
+      <w:r>
+        <w:rPr>
+          <w:rFonts w:ascii="Consolas" w:cs="Consolas" w:eastAsia="Consolas" w:hAnsi="Consolas"/>
+          <w:sz w:val="16"/>
+          <w:szCs w:val="16"/>
+        </w:rPr>
+        <w:t xml:space="preserve">      return {</w:t>
+      </w:r>
+    </w:p>
+    <w:p>
+      <w:pPr>
+        <w:spacing w:after="0" w:line="220"/>
+      </w:pPr>
+      <w:r>
+        <w:rPr>
+          <w:rFonts w:ascii="Consolas" w:cs="Consolas" w:eastAsia="Consolas" w:hAnsi="Consolas"/>
+          <w:sz w:val="16"/>
+          <w:szCs w:val="16"/>
+        </w:rPr>
+        <w:t xml:space="preserve">        from: '01/01/' + year,</w:t>
+      </w:r>
+    </w:p>
+    <w:p>
+      <w:pPr>
+        <w:spacing w:after="0" w:line="220"/>
+      </w:pPr>
+      <w:r>
+        <w:rPr>
+          <w:rFonts w:ascii="Consolas" w:cs="Consolas" w:eastAsia="Consolas" w:hAnsi="Consolas"/>
+          <w:sz w:val="16"/>
+          <w:szCs w:val="16"/>
+        </w:rPr>
+        <w:t xml:space="preserve">        to: pad2(now.getMonth() + 1) + '/' + pad2(now.getDate()) + '/' + year,</w:t>
+      </w:r>
+    </w:p>
+    <w:p>
+      <w:pPr>
+        <w:spacing w:after="0" w:line="220"/>
+      </w:pPr>
+      <w:r>
+        <w:rPr>
+          <w:rFonts w:ascii="Consolas" w:cs="Consolas" w:eastAsia="Consolas" w:hAnsi="Consolas"/>
+          <w:sz w:val="16"/>
+          <w:szCs w:val="16"/>
+        </w:rPr>
+        <w:t xml:space="preserve">      };</w:t>
+      </w:r>
+    </w:p>
+    <w:p>
+      <w:pPr>
+        <w:spacing w:after="0" w:line="220"/>
+      </w:pPr>
+      <w:r>
+        <w:rPr>
+          <w:rFonts w:ascii="Consolas" w:cs="Consolas" w:eastAsia="Consolas" w:hAnsi="Consolas"/>
+          <w:sz w:val="16"/>
+          <w:szCs w:val="16"/>
+        </w:rPr>
+        <w:t xml:space="preserve">    }</w:t>
+      </w:r>
+    </w:p>
+    <w:p>
+      <w:pPr>
+        <w:spacing w:after="0" w:line="220"/>
+      </w:pPr>
+      <w:r>
+        <w:rPr>
+          <w:rFonts w:ascii="Consolas" w:cs="Consolas" w:eastAsia="Consolas" w:hAnsi="Consolas"/>
+          <w:sz w:val="16"/>
+          <w:szCs w:val="16"/>
+        </w:rPr>
         <w:t xml:space="preserve">    return { from: '01/01/' + year, to: '12/31/' + year };</w:t>
       </w:r>
     </w:p>
@@ -12401,6 +12531,97 @@
           <w:sz w:val="16"/>
           <w:szCs w:val="16"/>
         </w:rPr>
+        <w:t xml:space="preserve">  // Filename suffix. The current year is partial, so label it as such instead</w:t>
+      </w:r>
+    </w:p>
+    <w:p>
+      <w:pPr>
+        <w:spacing w:after="0" w:line="220"/>
+      </w:pPr>
+      <w:r>
+        <w:rPr>
+          <w:rFonts w:ascii="Consolas" w:cs="Consolas" w:eastAsia="Consolas" w:hAnsi="Consolas"/>
+          <w:sz w:val="16"/>
+          <w:szCs w:val="16"/>
+        </w:rPr>
+        <w:t xml:space="preserve">  // of letting HistoricalPayroll_2026.xlsx imply a full year of data — the same</w:t>
+      </w:r>
+    </w:p>
+    <w:p>
+      <w:pPr>
+        <w:spacing w:after="0" w:line="220"/>
+      </w:pPr>
+      <w:r>
+        <w:rPr>
+          <w:rFonts w:ascii="Consolas" w:cs="Consolas" w:eastAsia="Consolas" w:hAnsi="Consolas"/>
+          <w:sz w:val="16"/>
+          <w:szCs w:val="16"/>
+        </w:rPr>
+        <w:t xml:space="preserve">  // convention the Paycom historical bot uses.</w:t>
+      </w:r>
+    </w:p>
+    <w:p>
+      <w:pPr>
+        <w:spacing w:after="0" w:line="220"/>
+      </w:pPr>
+      <w:r>
+        <w:rPr>
+          <w:rFonts w:ascii="Consolas" w:cs="Consolas" w:eastAsia="Consolas" w:hAnsi="Consolas"/>
+          <w:sz w:val="16"/>
+          <w:szCs w:val="16"/>
+        </w:rPr>
+        <w:t xml:space="preserve">  function yearLabel(year) {</w:t>
+      </w:r>
+    </w:p>
+    <w:p>
+      <w:pPr>
+        <w:spacing w:after="0" w:line="220"/>
+      </w:pPr>
+      <w:r>
+        <w:rPr>
+          <w:rFonts w:ascii="Consolas" w:cs="Consolas" w:eastAsia="Consolas" w:hAnsi="Consolas"/>
+          <w:sz w:val="16"/>
+          <w:szCs w:val="16"/>
+        </w:rPr>
+        <w:t xml:space="preserve">    return year === new Date().getFullYear() ? year + '-to-date' : String(year);</w:t>
+      </w:r>
+    </w:p>
+    <w:p>
+      <w:pPr>
+        <w:spacing w:after="0" w:line="220"/>
+      </w:pPr>
+      <w:r>
+        <w:rPr>
+          <w:rFonts w:ascii="Consolas" w:cs="Consolas" w:eastAsia="Consolas" w:hAnsi="Consolas"/>
+          <w:sz w:val="16"/>
+          <w:szCs w:val="16"/>
+        </w:rPr>
+        <w:t xml:space="preserve">  }</w:t>
+      </w:r>
+    </w:p>
+    <w:p>
+      <w:pPr>
+        <w:spacing w:after="0" w:line="220"/>
+      </w:pPr>
+      <w:r>
+        <w:rPr>
+          <w:rFonts w:ascii="Consolas" w:cs="Consolas" w:eastAsia="Consolas" w:hAnsi="Consolas"/>
+          <w:sz w:val="16"/>
+          <w:szCs w:val="16"/>
+        </w:rPr>
+        <w:t xml:space="preserve"> </w:t>
+      </w:r>
+    </w:p>
+    <w:p>
+      <w:pPr>
+        <w:spacing w:after="0" w:line="220"/>
+      </w:pPr>
+      <w:r>
+        <w:rPr>
+          <w:rFonts w:ascii="Consolas" w:cs="Consolas" w:eastAsia="Consolas" w:hAnsi="Consolas"/>
+          <w:sz w:val="16"/>
+          <w:szCs w:val="16"/>
+        </w:rPr>
         <w:t xml:space="preserve">  function pad2(n) { return String(n).padStart(2, '0'); }</w:t>
       </w:r>
     </w:p>
@@ -25713,7 +25934,7 @@
           <w:sz w:val="16"/>
           <w:szCs w:val="16"/>
         </w:rPr>
-        <w:t xml:space="preserve">    const fileName = 'HistoricalPayroll_' + year + '.xlsx';</w:t>
+        <w:t xml:space="preserve">    const fileName = 'HistoricalPayroll_' + yearLabel(year) + '.xlsx';</w:t>
       </w:r>
     </w:p>
     <w:p>
@@ -41404,33 +41625,85 @@
           <w:sz w:val="16"/>
           <w:szCs w:val="16"/>
         </w:rPr>
-        <w:t xml:space="preserve">  // Prior three calendar years, ascending. The CURRENT year is deliberately</w:t>
-      </w:r>
-    </w:p>
-    <w:p>
-      <w:pPr>
-        <w:spacing w:after="0" w:line="220"/>
-      </w:pPr>
-      <w:r>
-        <w:rPr>
-          <w:rFonts w:ascii="Consolas" w:cs="Consolas" w:eastAsia="Consolas" w:hAnsi="Consolas"/>
-          <w:sz w:val="16"/>
-          <w:szCs w:val="16"/>
-        </w:rPr>
-        <w:t xml:space="preserve">  // EXCLUDED — it is covered by the day-to-day adp-reports bot. Derived from</w:t>
-      </w:r>
-    </w:p>
-    <w:p>
-      <w:pPr>
-        <w:spacing w:after="0" w:line="220"/>
-      </w:pPr>
-      <w:r>
-        <w:rPr>
-          <w:rFonts w:ascii="Consolas" w:cs="Consolas" w:eastAsia="Consolas" w:hAnsi="Consolas"/>
-          <w:sz w:val="16"/>
-          <w:szCs w:val="16"/>
-        </w:rPr>
-        <w:t xml:space="preserve">  // the system clock, so this rolls over on its own each January.</w:t>
+        <w:t xml:space="preserve">  // Prior three calendar years PLUS the current one, ascending. The current</w:t>
+      </w:r>
+    </w:p>
+    <w:p>
+      <w:pPr>
+        <w:spacing w:after="0" w:line="220"/>
+      </w:pPr>
+      <w:r>
+        <w:rPr>
+          <w:rFonts w:ascii="Consolas" w:cs="Consolas" w:eastAsia="Consolas" w:hAnsi="Consolas"/>
+          <w:sz w:val="16"/>
+          <w:szCs w:val="16"/>
+        </w:rPr>
+        <w:t xml:space="preserve">  // year used to be excluded on the grounds that the day-to-day adp-reports bot</w:t>
+      </w:r>
+    </w:p>
+    <w:p>
+      <w:pPr>
+        <w:spacing w:after="0" w:line="220"/>
+      </w:pPr>
+      <w:r>
+        <w:rPr>
+          <w:rFonts w:ascii="Consolas" w:cs="Consolas" w:eastAsia="Consolas" w:hAnsi="Consolas"/>
+          <w:sz w:val="16"/>
+          <w:szCs w:val="16"/>
+        </w:rPr>
+        <w:t xml:space="preserve">  // covers it, but a migration needs one continuous Payroll History set — and</w:t>
+      </w:r>
+    </w:p>
+    <w:p>
+      <w:pPr>
+        <w:spacing w:after="0" w:line="220"/>
+      </w:pPr>
+      <w:r>
+        <w:rPr>
+          <w:rFonts w:ascii="Consolas" w:cs="Consolas" w:eastAsia="Consolas" w:hAnsi="Consolas"/>
+          <w:sz w:val="16"/>
+          <w:szCs w:val="16"/>
+        </w:rPr>
+        <w:t xml:space="preserve">  // that bot pulls per-pay-period files, not a consolidated year. It runs</w:t>
+      </w:r>
+    </w:p>
+    <w:p>
+      <w:pPr>
+        <w:spacing w:after="0" w:line="220"/>
+      </w:pPr>
+      <w:r>
+        <w:rPr>
+          <w:rFonts w:ascii="Consolas" w:cs="Consolas" w:eastAsia="Consolas" w:hAnsi="Consolas"/>
+          <w:sz w:val="16"/>
+          <w:szCs w:val="16"/>
+        </w:rPr>
+        <w:t xml:space="preserve">  // 1 Jan → today (see yearDateRange) and is saved as &lt;year&gt;-to-date. Untick it</w:t>
+      </w:r>
+    </w:p>
+    <w:p>
+      <w:pPr>
+        <w:spacing w:after="0" w:line="220"/>
+      </w:pPr>
+      <w:r>
+        <w:rPr>
+          <w:rFonts w:ascii="Consolas" w:cs="Consolas" w:eastAsia="Consolas" w:hAnsi="Consolas"/>
+          <w:sz w:val="16"/>
+          <w:szCs w:val="16"/>
+        </w:rPr>
+        <w:t xml:space="preserve">  // in the picker when it isn't wanted. Derived from the system clock, so this</w:t>
+      </w:r>
+    </w:p>
+    <w:p>
+      <w:pPr>
+        <w:spacing w:after="0" w:line="220"/>
+      </w:pPr>
+      <w:r>
+        <w:rPr>
+          <w:rFonts w:ascii="Consolas" w:cs="Consolas" w:eastAsia="Consolas" w:hAnsi="Consolas"/>
+          <w:sz w:val="16"/>
+          <w:szCs w:val="16"/>
+        </w:rPr>
+        <w:t xml:space="preserve">  // rolls over on its own each January.</w:t>
       </w:r>
     </w:p>
     <w:p>
@@ -41469,7 +41742,7 @@
           <w:sz w:val="16"/>
           <w:szCs w:val="16"/>
         </w:rPr>
-        <w:t xml:space="preserve">    return [y - 3, y - 2, y - 1];</w:t>
+        <w:t xml:space="preserve">    return [y - 3, y - 2, y - 1, y];</w:t>
       </w:r>
     </w:p>
     <w:p>
@@ -43536,7 +43809,20 @@
           <w:sz w:val="16"/>
           <w:szCs w:val="16"/>
         </w:rPr>
-        <w:t xml:space="preserve">      hint.textContent = 'Select the year(s) to download. One consolidated file per year.';</w:t>
+        <w:t xml:space="preserve">      hint.textContent = 'Select the year(s) to download. One consolidated file per year — '</w:t>
+      </w:r>
+    </w:p>
+    <w:p>
+      <w:pPr>
+        <w:spacing w:after="0" w:line="220"/>
+      </w:pPr>
+      <w:r>
+        <w:rPr>
+          <w:rFonts w:ascii="Consolas" w:cs="Consolas" w:eastAsia="Consolas" w:hAnsi="Consolas"/>
+          <w:sz w:val="16"/>
+          <w:szCs w:val="16"/>
+        </w:rPr>
+        <w:t xml:space="preserve">        + 'the current year runs 1 Jan → today and is saved as &lt;year&gt;-to-date.';</w:t>
       </w:r>
     </w:p>
     <w:p>

</xml_diff>

<commit_message>
fix(adp-historical): recognise the reportviewer/download file URL (v1.15.0)
Payroll History clicked the right item and the sniffer captured BOTH URLs, but
isFileUrl did not know the third shape, so the launcher page won by default:

  captured: ["auditOutput.do",
             "/mascsr/wfn/ireporting/metaservices/reportviewer/download/BIRT141769701_PROD_DC2"]

The run then fetched auditOutput.do, got HTML, failed to mine a file link out
of it, and gave up with 'could not reach the real file' — while the answer was
sitting in its own diagnostics line.

Match reportviewer/download and /BIRT<digits> as well. Verified against the
captured URLs: the real file matches, the launcher does not, and the three
previously-working shapes still do.

Co-Authored-By: Claude Opus 5 <noreply@anthropic.com>
</commit_message>
<xml_diff>
--- a/distribution-docs/ADP Historical Data Bot.docx
+++ b/distribution-docs/ADP Historical Data Bot.docx
@@ -64,7 +64,7 @@
           <w:sz w:val="16"/>
           <w:szCs w:val="16"/>
         </w:rPr>
-        <w:t xml:space="preserve">// @version      1.14.0</w:t>
+        <w:t xml:space="preserve">// @version      1.15.0</w:t>
       </w:r>
     </w:p>
     <w:p>
@@ -649,7 +649,7 @@
           <w:sz w:val="16"/>
           <w:szCs w:val="16"/>
         </w:rPr>
-        <w:t xml:space="preserve">    return '1.14.0';</w:t>
+        <w:t xml:space="preserve">    return '1.15.0';</w:t>
       </w:r>
     </w:p>
     <w:p>
@@ -23009,72 +23009,137 @@
           <w:sz w:val="16"/>
           <w:szCs w:val="16"/>
         </w:rPr>
-        <w:t xml:space="preserve">    // The real spreadsheet lives at …/downloadTemplate/?instanceRefId=BIRT…;</w:t>
-      </w:r>
-    </w:p>
-    <w:p>
-      <w:pPr>
-        <w:spacing w:after="0" w:line="220"/>
-      </w:pPr>
-      <w:r>
-        <w:rPr>
-          <w:rFonts w:ascii="Consolas" w:cs="Consolas" w:eastAsia="Consolas" w:hAnsi="Consolas"/>
-          <w:sz w:val="16"/>
-          <w:szCs w:val="16"/>
-        </w:rPr>
-        <w:t xml:space="preserve">    // the first thing ADP opens is usually a launcher page (auditOutput.do).</w:t>
-      </w:r>
-    </w:p>
-    <w:p>
-      <w:pPr>
-        <w:spacing w:after="0" w:line="220"/>
-      </w:pPr>
-      <w:r>
-        <w:rPr>
-          <w:rFonts w:ascii="Consolas" w:cs="Consolas" w:eastAsia="Consolas" w:hAnsi="Consolas"/>
-          <w:sz w:val="16"/>
-          <w:szCs w:val="16"/>
-        </w:rPr>
-        <w:t xml:space="preserve">    // Two file-URL shapes exist: BIRT reports (Payroll History etc.) use</w:t>
-      </w:r>
-    </w:p>
-    <w:p>
-      <w:pPr>
-        <w:spacing w:after="0" w:line="220"/>
-      </w:pPr>
-      <w:r>
-        <w:rPr>
-          <w:rFonts w:ascii="Consolas" w:cs="Consolas" w:eastAsia="Consolas" w:hAnsi="Consolas"/>
-          <w:sz w:val="16"/>
-          <w:szCs w:val="16"/>
-        </w:rPr>
-        <w:t xml:space="preserve">    // …/downloadTemplate/?instanceRefId=BIRT…; legacy T&amp;A reports (Timecard w/</w:t>
-      </w:r>
-    </w:p>
-    <w:p>
-      <w:pPr>
-        <w:spacing w:after="0" w:line="220"/>
-      </w:pPr>
-      <w:r>
-        <w:rPr>
-          <w:rFonts w:ascii="Consolas" w:cs="Consolas" w:eastAsia="Consolas" w:hAnsi="Consolas"/>
-          <w:sz w:val="16"/>
-          <w:szCs w:val="16"/>
-        </w:rPr>
-        <w:t xml:space="preserve">    // Supervisor Approval) use /mascsr/wfntlm/reports/v2/downloadreport?referenceId=…</w:t>
-      </w:r>
-    </w:p>
-    <w:p>
-      <w:pPr>
-        <w:spacing w:after="0" w:line="220"/>
-      </w:pPr>
-      <w:r>
-        <w:rPr>
-          <w:rFonts w:ascii="Consolas" w:cs="Consolas" w:eastAsia="Consolas" w:hAnsi="Consolas"/>
-          <w:sz w:val="16"/>
-          <w:szCs w:val="16"/>
-        </w:rPr>
-        <w:t xml:space="preserve">    const isFileUrl = (u) =&gt; /downloadTemplate|instanceRefId|downloadreport|referenceId=|\.(xlsx?|csv)(\?|$)/i.test(u);</w:t>
+        <w:t xml:space="preserve">    // The first thing ADP opens is usually a launcher page (auditOutput.do);</w:t>
+      </w:r>
+    </w:p>
+    <w:p>
+      <w:pPr>
+        <w:spacing w:after="0" w:line="220"/>
+      </w:pPr>
+      <w:r>
+        <w:rPr>
+          <w:rFonts w:ascii="Consolas" w:cs="Consolas" w:eastAsia="Consolas" w:hAnsi="Consolas"/>
+          <w:sz w:val="16"/>
+          <w:szCs w:val="16"/>
+        </w:rPr>
+        <w:t xml:space="preserve">    // the real file is a SECOND captured URL. Three shapes seen live:</w:t>
+      </w:r>
+    </w:p>
+    <w:p>
+      <w:pPr>
+        <w:spacing w:after="0" w:line="220"/>
+      </w:pPr>
+      <w:r>
+        <w:rPr>
+          <w:rFonts w:ascii="Consolas" w:cs="Consolas" w:eastAsia="Consolas" w:hAnsi="Consolas"/>
+          <w:sz w:val="16"/>
+          <w:szCs w:val="16"/>
+        </w:rPr>
+        <w:t xml:space="preserve">    //   …/downloadTemplate/?instanceRefId=BIRT…              (some BIRT reports)</w:t>
+      </w:r>
+    </w:p>
+    <w:p>
+      <w:pPr>
+        <w:spacing w:after="0" w:line="220"/>
+      </w:pPr>
+      <w:r>
+        <w:rPr>
+          <w:rFonts w:ascii="Consolas" w:cs="Consolas" w:eastAsia="Consolas" w:hAnsi="Consolas"/>
+          <w:sz w:val="16"/>
+          <w:szCs w:val="16"/>
+        </w:rPr>
+        <w:t xml:space="preserve">    //   /mascsr/wfntlm/reports/v2/downloadreport?referenceId=…   (legacy T&amp;A)</w:t>
+      </w:r>
+    </w:p>
+    <w:p>
+      <w:pPr>
+        <w:spacing w:after="0" w:line="220"/>
+      </w:pPr>
+      <w:r>
+        <w:rPr>
+          <w:rFonts w:ascii="Consolas" w:cs="Consolas" w:eastAsia="Consolas" w:hAnsi="Consolas"/>
+          <w:sz w:val="16"/>
+          <w:szCs w:val="16"/>
+        </w:rPr>
+        <w:t xml:space="preserve">    //   /mascsr/wfn/ireporting/metaservices/reportviewer/download/BIRT&lt;id&gt;_PROD_DC2</w:t>
+      </w:r>
+    </w:p>
+    <w:p>
+      <w:pPr>
+        <w:spacing w:after="0" w:line="220"/>
+      </w:pPr>
+      <w:r>
+        <w:rPr>
+          <w:rFonts w:ascii="Consolas" w:cs="Consolas" w:eastAsia="Consolas" w:hAnsi="Consolas"/>
+          <w:sz w:val="16"/>
+          <w:szCs w:val="16"/>
+        </w:rPr>
+        <w:t xml:space="preserve">    //                                                        (Payroll History)</w:t>
+      </w:r>
+    </w:p>
+    <w:p>
+      <w:pPr>
+        <w:spacing w:after="0" w:line="220"/>
+      </w:pPr>
+      <w:r>
+        <w:rPr>
+          <w:rFonts w:ascii="Consolas" w:cs="Consolas" w:eastAsia="Consolas" w:hAnsi="Consolas"/>
+          <w:sz w:val="16"/>
+          <w:szCs w:val="16"/>
+        </w:rPr>
+        <w:t xml:space="preserve">    // The third was captured correctly but not RECOGNISED, so the launcher page</w:t>
+      </w:r>
+    </w:p>
+    <w:p>
+      <w:pPr>
+        <w:spacing w:after="0" w:line="220"/>
+      </w:pPr>
+      <w:r>
+        <w:rPr>
+          <w:rFonts w:ascii="Consolas" w:cs="Consolas" w:eastAsia="Consolas" w:hAnsi="Consolas"/>
+          <w:sz w:val="16"/>
+          <w:szCs w:val="16"/>
+        </w:rPr>
+        <w:t xml:space="preserve">    // won by default and the run ended with "could not reach the real file"</w:t>
+      </w:r>
+    </w:p>
+    <w:p>
+      <w:pPr>
+        <w:spacing w:after="0" w:line="220"/>
+      </w:pPr>
+      <w:r>
+        <w:rPr>
+          <w:rFonts w:ascii="Consolas" w:cs="Consolas" w:eastAsia="Consolas" w:hAnsi="Consolas"/>
+          <w:sz w:val="16"/>
+          <w:szCs w:val="16"/>
+        </w:rPr>
+        <w:t xml:space="preserve">    // while the answer sat in the diagnostics line. Keep this list in step with</w:t>
+      </w:r>
+    </w:p>
+    <w:p>
+      <w:pPr>
+        <w:spacing w:after="0" w:line="220"/>
+      </w:pPr>
+      <w:r>
+        <w:rPr>
+          <w:rFonts w:ascii="Consolas" w:cs="Consolas" w:eastAsia="Consolas" w:hAnsi="Consolas"/>
+          <w:sz w:val="16"/>
+          <w:szCs w:val="16"/>
+        </w:rPr>
+        <w:t xml:space="preserve">    // whatever the diagnostics show.</w:t>
+      </w:r>
+    </w:p>
+    <w:p>
+      <w:pPr>
+        <w:spacing w:after="0" w:line="220"/>
+      </w:pPr>
+      <w:r>
+        <w:rPr>
+          <w:rFonts w:ascii="Consolas" w:cs="Consolas" w:eastAsia="Consolas" w:hAnsi="Consolas"/>
+          <w:sz w:val="16"/>
+          <w:szCs w:val="16"/>
+        </w:rPr>
+        <w:t xml:space="preserve">    const isFileUrl = (u) =&gt; /downloadTemplate|instanceRefId|downloadreport|reportviewer\/download|\/BIRT\d|referenceId=|\.(xlsx?|csv)(\?|$)/i.test(u);</w:t>
       </w:r>
     </w:p>
     <w:p>

</xml_diff>